<commit_message>
Add Content Authoring Kit (schemas, validator, topic tree, companion prompts, report); correct Tangerine AI wording
Co-Authored-By: Claude Sonnet 5.5 <noreply@anthropic.com>
Claude-Session: https://claude.ai/code/session_01PTgaxw19V2a54numdiB8gc
</commit_message>
<xml_diff>
--- a/Nursing app master plan/App 4 tangerine prep inspired research/Tangerine_Prep_Research.docx
+++ b/Nursing app master plan/App 4 tangerine prep inspired research/Tangerine_Prep_Research.docx
@@ -47,7 +47,7 @@
         <w:t xml:space="preserve">What it is. </w:t>
       </w:r>
       <w:r>
-        <w:t>A mobile exam-prep app for the Philippine Nurse Licensure Examination (PNLE; NCLEX also mentioned), with AI practice questions, mock board exams, an adaptive exam, NCLEX-style case studies, flashcards, a study planner, an AI tutor persona called Cleo, battles between friends, social groups, streaks and a paid tier.</w:t>
+        <w:t>A mobile exam-prep app for the Philippine Nurse Licensure Examination (PNLE; NCLEX also mentioned), with AI-curated practice sets, mock board exams, an adaptive exam, NCLEX-style case studies, flashcards, a study planner, an AI tutor persona called Cleo, battles between friends, social groups, streaks and a paid tier.</w:t>
       </w:r>
     </w:p>
     <w:p>
@@ -1029,7 +1029,7 @@
               <w:rPr>
                 <w:sz w:val="19"/>
               </w:rPr>
-              <w:t>Custom (choose areas and count), AI (Cleo generates questions), Mock Board, Adaptive Exam (a learner model called "Chev"), and a coaching waitlist pilot.</w:t>
+              <w:t>Custom (choose areas and count), AI (Cleo curates a set from the existing question bank; it does not write new exam questions), Mock Board, Adaptive Exam (a learner model called "Chev"), and a coaching waitlist pilot.</w:t>
             </w:r>
           </w:p>
         </w:tc>
@@ -1059,7 +1059,7 @@
               <w:rPr>
                 <w:sz w:val="19"/>
               </w:rPr>
-              <w:t>NCLEX-style items: mcq, sata (select all that apply), matrix, highlight and cloze, scored in credits (partial credit).</w:t>
+              <w:t>Pre-authored cases served from /situations/v2/. Their items are mcq, sata (select all that apply), matrix, highlight, cloze and free_response, scored in credits with partial credit. Ordinary practice questions are single-select only.</w:t>
             </w:r>
           </w:p>
         </w:tc>

</xml_diff>